<commit_message>
add email sending functionality
</commit_message>
<xml_diff>
--- a/Documentation/📘 DOCTOR APPOINTMENT MANAGEMENT SYSTEM ( CareSlot ).docx
+++ b/Documentation/📘 DOCTOR APPOINTMENT MANAGEMENT SYSTEM ( CareSlot ).docx
@@ -3682,6 +3682,7 @@
         <w:t xml:space="preserve"> (</w:t>
       </w:r>
       <w:proofErr w:type="spellStart"/>
+      <w:proofErr w:type="gramStart"/>
       <w:r>
         <w:rPr>
           <w:rFonts w:ascii="Arial" w:hAnsi="Arial" w:cs="Arial"/>
@@ -3691,30 +3692,61 @@
         <w:t>name,email</w:t>
       </w:r>
       <w:proofErr w:type="spellEnd"/>
-      <w:r>
-        <w:rPr>
-          <w:rFonts w:ascii="Arial" w:hAnsi="Arial" w:cs="Arial"/>
-          <w:sz w:val="24"/>
-          <w:szCs w:val="24"/>
-        </w:rPr>
-        <w:t xml:space="preserve">, image, </w:t>
-      </w:r>
-      <w:r>
-        <w:rPr>
-          <w:rFonts w:ascii="Arial" w:hAnsi="Arial" w:cs="Arial"/>
-          <w:sz w:val="24"/>
-          <w:szCs w:val="24"/>
-        </w:rPr>
-        <w:t xml:space="preserve">Number of  booking it’s Patient </w:t>
-      </w:r>
-      <w:r>
-        <w:rPr>
-          <w:rFonts w:ascii="Arial" w:hAnsi="Arial" w:cs="Arial"/>
-          <w:sz w:val="24"/>
-          <w:szCs w:val="24"/>
-        </w:rPr>
-        <w:t>)</w:t>
-      </w:r>
+      <w:proofErr w:type="gramEnd"/>
+      <w:r>
+        <w:rPr>
+          <w:rFonts w:ascii="Arial" w:hAnsi="Arial" w:cs="Arial"/>
+          <w:sz w:val="24"/>
+          <w:szCs w:val="24"/>
+        </w:rPr>
+        <w:t xml:space="preserve">, image, Number </w:t>
+      </w:r>
+      <w:proofErr w:type="gramStart"/>
+      <w:r>
+        <w:rPr>
+          <w:rFonts w:ascii="Arial" w:hAnsi="Arial" w:cs="Arial"/>
+          <w:sz w:val="24"/>
+          <w:szCs w:val="24"/>
+        </w:rPr>
+        <w:t>of  booking</w:t>
+      </w:r>
+      <w:proofErr w:type="gramEnd"/>
+      <w:r>
+        <w:rPr>
+          <w:rFonts w:ascii="Arial" w:hAnsi="Arial" w:cs="Arial"/>
+          <w:sz w:val="24"/>
+          <w:szCs w:val="24"/>
+        </w:rPr>
+        <w:t xml:space="preserve"> </w:t>
+      </w:r>
+      <w:proofErr w:type="gramStart"/>
+      <w:r>
+        <w:rPr>
+          <w:rFonts w:ascii="Arial" w:hAnsi="Arial" w:cs="Arial"/>
+          <w:sz w:val="24"/>
+          <w:szCs w:val="24"/>
+        </w:rPr>
+        <w:t>it’s</w:t>
+      </w:r>
+      <w:proofErr w:type="gramEnd"/>
+      <w:r>
+        <w:rPr>
+          <w:rFonts w:ascii="Arial" w:hAnsi="Arial" w:cs="Arial"/>
+          <w:sz w:val="24"/>
+          <w:szCs w:val="24"/>
+        </w:rPr>
+        <w:t xml:space="preserve"> </w:t>
+      </w:r>
+      <w:proofErr w:type="gramStart"/>
+      <w:r>
+        <w:rPr>
+          <w:rFonts w:ascii="Arial" w:hAnsi="Arial" w:cs="Arial"/>
+          <w:sz w:val="24"/>
+          <w:szCs w:val="24"/>
+        </w:rPr>
+        <w:t>Patient )</w:t>
+      </w:r>
+      <w:proofErr w:type="gramEnd"/>
     </w:p>
     <w:p>
       <w:pPr>
@@ -4126,6 +4158,27 @@
           <w:sz w:val="24"/>
           <w:szCs w:val="24"/>
         </w:rPr>
+        <w:t xml:space="preserve">Email Notification Integration </w:t>
+      </w:r>
+    </w:p>
+    <w:p>
+      <w:pPr>
+        <w:numPr>
+          <w:ilvl w:val="0"/>
+          <w:numId w:val="19"/>
+        </w:numPr>
+        <w:rPr>
+          <w:rFonts w:ascii="Arial" w:hAnsi="Arial" w:cs="Arial"/>
+          <w:sz w:val="24"/>
+          <w:szCs w:val="24"/>
+        </w:rPr>
+      </w:pPr>
+      <w:r>
+        <w:rPr>
+          <w:rFonts w:ascii="Arial" w:hAnsi="Arial" w:cs="Arial"/>
+          <w:sz w:val="24"/>
+          <w:szCs w:val="24"/>
+        </w:rPr>
         <w:t>Secure API routes</w:t>
       </w:r>
     </w:p>
@@ -4584,6 +4637,7 @@
     </w:p>
     <w:p>
       <w:pPr>
+        <w:pStyle w:val="ListParagraph"/>
         <w:numPr>
           <w:ilvl w:val="1"/>
           <w:numId w:val="23"/>
@@ -4605,6 +4659,7 @@
     </w:p>
     <w:p>
       <w:pPr>
+        <w:pStyle w:val="ListParagraph"/>
         <w:numPr>
           <w:ilvl w:val="1"/>
           <w:numId w:val="23"/>
@@ -4626,6 +4681,7 @@
     </w:p>
     <w:p>
       <w:pPr>
+        <w:pStyle w:val="ListParagraph"/>
         <w:numPr>
           <w:ilvl w:val="1"/>
           <w:numId w:val="23"/>
@@ -4670,6 +4726,7 @@
     </w:p>
     <w:p>
       <w:pPr>
+        <w:pStyle w:val="ListParagraph"/>
         <w:numPr>
           <w:ilvl w:val="1"/>
           <w:numId w:val="23"/>
@@ -4691,6 +4748,7 @@
     </w:p>
     <w:p>
       <w:pPr>
+        <w:pStyle w:val="ListParagraph"/>
         <w:numPr>
           <w:ilvl w:val="1"/>
           <w:numId w:val="23"/>
@@ -4736,6 +4794,7 @@
     </w:p>
     <w:p>
       <w:pPr>
+        <w:pStyle w:val="ListParagraph"/>
         <w:numPr>
           <w:ilvl w:val="1"/>
           <w:numId w:val="23"/>
@@ -4820,6 +4879,7 @@
     </w:p>
     <w:p>
       <w:pPr>
+        <w:pStyle w:val="ListParagraph"/>
         <w:numPr>
           <w:ilvl w:val="1"/>
           <w:numId w:val="24"/>
@@ -4864,6 +4924,7 @@
     </w:p>
     <w:p>
       <w:pPr>
+        <w:pStyle w:val="ListParagraph"/>
         <w:numPr>
           <w:ilvl w:val="1"/>
           <w:numId w:val="24"/>
@@ -4885,6 +4946,7 @@
     </w:p>
     <w:p>
       <w:pPr>
+        <w:pStyle w:val="ListParagraph"/>
         <w:numPr>
           <w:ilvl w:val="1"/>
           <w:numId w:val="24"/>
@@ -4969,6 +5031,7 @@
     </w:p>
     <w:p>
       <w:pPr>
+        <w:pStyle w:val="ListParagraph"/>
         <w:numPr>
           <w:ilvl w:val="1"/>
           <w:numId w:val="25"/>
@@ -4990,6 +5053,7 @@
     </w:p>
     <w:p>
       <w:pPr>
+        <w:pStyle w:val="ListParagraph"/>
         <w:numPr>
           <w:ilvl w:val="1"/>
           <w:numId w:val="25"/>
@@ -5034,6 +5098,7 @@
     </w:p>
     <w:p>
       <w:pPr>
+        <w:pStyle w:val="ListParagraph"/>
         <w:numPr>
           <w:ilvl w:val="1"/>
           <w:numId w:val="25"/>
@@ -5065,6 +5130,7 @@
     </w:p>
     <w:p>
       <w:pPr>
+        <w:pStyle w:val="ListParagraph"/>
         <w:numPr>
           <w:ilvl w:val="1"/>
           <w:numId w:val="25"/>
@@ -5149,6 +5215,7 @@
     </w:p>
     <w:p>
       <w:pPr>
+        <w:pStyle w:val="ListParagraph"/>
         <w:numPr>
           <w:ilvl w:val="1"/>
           <w:numId w:val="26"/>
@@ -5195,6 +5262,7 @@
     </w:p>
     <w:p>
       <w:pPr>
+        <w:pStyle w:val="ListParagraph"/>
         <w:numPr>
           <w:ilvl w:val="1"/>
           <w:numId w:val="26"/>
@@ -5281,6 +5349,7 @@
     </w:p>
     <w:p>
       <w:pPr>
+        <w:pStyle w:val="ListParagraph"/>
         <w:numPr>
           <w:ilvl w:val="1"/>
           <w:numId w:val="27"/>
@@ -5302,6 +5371,7 @@
     </w:p>
     <w:p>
       <w:pPr>
+        <w:pStyle w:val="ListParagraph"/>
         <w:numPr>
           <w:ilvl w:val="1"/>
           <w:numId w:val="27"/>
@@ -5358,6 +5428,122 @@
           <w:sz w:val="24"/>
           <w:szCs w:val="24"/>
         </w:rPr>
+        <w:t>5.6 Email Notification</w:t>
+      </w:r>
+    </w:p>
+    <w:p>
+      <w:pPr>
+        <w:rPr>
+          <w:rFonts w:ascii="Arial" w:hAnsi="Arial" w:cs="Arial"/>
+          <w:b/>
+          <w:bCs/>
+          <w:sz w:val="24"/>
+          <w:szCs w:val="24"/>
+        </w:rPr>
+      </w:pPr>
+      <w:r>
+        <w:rPr>
+          <w:rFonts w:ascii="Arial" w:hAnsi="Arial" w:cs="Arial"/>
+          <w:b/>
+          <w:bCs/>
+          <w:sz w:val="24"/>
+          <w:szCs w:val="24"/>
+        </w:rPr>
+        <w:t xml:space="preserve">• </w:t>
+      </w:r>
+      <w:proofErr w:type="spellStart"/>
+      <w:r>
+        <w:rPr>
+          <w:rFonts w:ascii="Arial" w:hAnsi="Arial" w:cs="Arial"/>
+          <w:b/>
+          <w:bCs/>
+          <w:sz w:val="24"/>
+          <w:szCs w:val="24"/>
+        </w:rPr>
+        <w:t>Nodemailer</w:t>
+      </w:r>
+      <w:proofErr w:type="spellEnd"/>
+    </w:p>
+    <w:p>
+      <w:pPr>
+        <w:pStyle w:val="ListParagraph"/>
+        <w:numPr>
+          <w:ilvl w:val="0"/>
+          <w:numId w:val="38"/>
+        </w:numPr>
+        <w:rPr>
+          <w:rFonts w:ascii="Arial" w:hAnsi="Arial" w:cs="Arial"/>
+          <w:sz w:val="24"/>
+          <w:szCs w:val="24"/>
+        </w:rPr>
+      </w:pPr>
+      <w:r>
+        <w:rPr>
+          <w:rFonts w:ascii="Arial" w:hAnsi="Arial" w:cs="Arial"/>
+          <w:sz w:val="24"/>
+          <w:szCs w:val="24"/>
+        </w:rPr>
+        <w:t>Server-side email sending</w:t>
+      </w:r>
+    </w:p>
+    <w:p>
+      <w:pPr>
+        <w:pStyle w:val="ListParagraph"/>
+        <w:numPr>
+          <w:ilvl w:val="0"/>
+          <w:numId w:val="38"/>
+        </w:numPr>
+        <w:rPr>
+          <w:rFonts w:ascii="Arial" w:hAnsi="Arial" w:cs="Arial"/>
+          <w:sz w:val="24"/>
+          <w:szCs w:val="24"/>
+        </w:rPr>
+      </w:pPr>
+      <w:r>
+        <w:rPr>
+          <w:rFonts w:ascii="Arial" w:hAnsi="Arial" w:cs="Arial"/>
+          <w:sz w:val="24"/>
+          <w:szCs w:val="24"/>
+        </w:rPr>
+        <w:t>SMTP integration</w:t>
+      </w:r>
+    </w:p>
+    <w:p>
+      <w:pPr>
+        <w:pStyle w:val="ListParagraph"/>
+        <w:numPr>
+          <w:ilvl w:val="0"/>
+          <w:numId w:val="38"/>
+        </w:numPr>
+        <w:rPr>
+          <w:rFonts w:ascii="Arial" w:hAnsi="Arial" w:cs="Arial"/>
+          <w:sz w:val="24"/>
+          <w:szCs w:val="24"/>
+        </w:rPr>
+      </w:pPr>
+      <w:r>
+        <w:rPr>
+          <w:rFonts w:ascii="Arial" w:hAnsi="Arial" w:cs="Arial"/>
+          <w:sz w:val="24"/>
+          <w:szCs w:val="24"/>
+        </w:rPr>
+        <w:t>Automated transactional emails (OTP, password reset, order confirmation, etc.)</w:t>
+      </w:r>
+    </w:p>
+    <w:p>
+      <w:pPr>
+        <w:rPr>
+          <w:rFonts w:ascii="Arial" w:hAnsi="Arial" w:cs="Arial"/>
+          <w:sz w:val="24"/>
+          <w:szCs w:val="24"/>
+        </w:rPr>
+      </w:pPr>
+      <w:r>
+        <w:rPr>
+          <w:rFonts w:ascii="Arial" w:hAnsi="Arial" w:cs="Arial"/>
+          <w:sz w:val="24"/>
+          <w:szCs w:val="24"/>
+        </w:rPr>
         <w:br w:type="page"/>
       </w:r>
     </w:p>
@@ -5583,27 +5769,6 @@
           <w:szCs w:val="24"/>
         </w:rPr>
         <w:t xml:space="preserve"> Future Enhancements</w:t>
-      </w:r>
-    </w:p>
-    <w:p>
-      <w:pPr>
-        <w:numPr>
-          <w:ilvl w:val="0"/>
-          <w:numId w:val="29"/>
-        </w:numPr>
-        <w:rPr>
-          <w:rFonts w:ascii="Arial" w:hAnsi="Arial" w:cs="Arial"/>
-          <w:sz w:val="24"/>
-          <w:szCs w:val="24"/>
-        </w:rPr>
-      </w:pPr>
-      <w:r>
-        <w:rPr>
-          <w:rFonts w:ascii="Arial" w:hAnsi="Arial" w:cs="Arial"/>
-          <w:sz w:val="24"/>
-          <w:szCs w:val="24"/>
-        </w:rPr>
-        <w:t>Email notification system</w:t>
       </w:r>
     </w:p>
     <w:p>
@@ -7679,6 +7844,155 @@
     </w:lvl>
   </w:abstractNum>
   <w:abstractNum w:abstractNumId="13" w15:restartNumberingAfterBreak="0">
+    <w:nsid w:val="2D195B2F"/>
+    <w:multiLevelType w:val="multilevel"/>
+    <w:tmpl w:val="663EF6D8"/>
+    <w:lvl w:ilvl="0">
+      <w:start w:val="1"/>
+      <w:numFmt w:val="bullet"/>
+      <w:lvlText w:val=""/>
+      <w:lvlJc w:val="left"/>
+      <w:pPr>
+        <w:tabs>
+          <w:tab w:val="num" w:pos="720"/>
+        </w:tabs>
+        <w:ind w:left="720" w:hanging="360"/>
+      </w:pPr>
+      <w:rPr>
+        <w:rFonts w:ascii="Symbol" w:hAnsi="Symbol" w:hint="default"/>
+        <w:sz w:val="20"/>
+      </w:rPr>
+    </w:lvl>
+    <w:lvl w:ilvl="1" w:tentative="1">
+      <w:start w:val="1"/>
+      <w:numFmt w:val="bullet"/>
+      <w:lvlText w:val="o"/>
+      <w:lvlJc w:val="left"/>
+      <w:pPr>
+        <w:tabs>
+          <w:tab w:val="num" w:pos="1440"/>
+        </w:tabs>
+        <w:ind w:left="1440" w:hanging="360"/>
+      </w:pPr>
+      <w:rPr>
+        <w:rFonts w:ascii="Courier New" w:hAnsi="Courier New" w:hint="default"/>
+        <w:sz w:val="20"/>
+      </w:rPr>
+    </w:lvl>
+    <w:lvl w:ilvl="2" w:tentative="1">
+      <w:start w:val="1"/>
+      <w:numFmt w:val="bullet"/>
+      <w:lvlText w:val=""/>
+      <w:lvlJc w:val="left"/>
+      <w:pPr>
+        <w:tabs>
+          <w:tab w:val="num" w:pos="2160"/>
+        </w:tabs>
+        <w:ind w:left="2160" w:hanging="360"/>
+      </w:pPr>
+      <w:rPr>
+        <w:rFonts w:ascii="Wingdings" w:hAnsi="Wingdings" w:hint="default"/>
+        <w:sz w:val="20"/>
+      </w:rPr>
+    </w:lvl>
+    <w:lvl w:ilvl="3" w:tentative="1">
+      <w:start w:val="1"/>
+      <w:numFmt w:val="bullet"/>
+      <w:lvlText w:val=""/>
+      <w:lvlJc w:val="left"/>
+      <w:pPr>
+        <w:tabs>
+          <w:tab w:val="num" w:pos="2880"/>
+        </w:tabs>
+        <w:ind w:left="2880" w:hanging="360"/>
+      </w:pPr>
+      <w:rPr>
+        <w:rFonts w:ascii="Wingdings" w:hAnsi="Wingdings" w:hint="default"/>
+        <w:sz w:val="20"/>
+      </w:rPr>
+    </w:lvl>
+    <w:lvl w:ilvl="4" w:tentative="1">
+      <w:start w:val="1"/>
+      <w:numFmt w:val="bullet"/>
+      <w:lvlText w:val=""/>
+      <w:lvlJc w:val="left"/>
+      <w:pPr>
+        <w:tabs>
+          <w:tab w:val="num" w:pos="3600"/>
+        </w:tabs>
+        <w:ind w:left="3600" w:hanging="360"/>
+      </w:pPr>
+      <w:rPr>
+        <w:rFonts w:ascii="Wingdings" w:hAnsi="Wingdings" w:hint="default"/>
+        <w:sz w:val="20"/>
+      </w:rPr>
+    </w:lvl>
+    <w:lvl w:ilvl="5" w:tentative="1">
+      <w:start w:val="1"/>
+      <w:numFmt w:val="bullet"/>
+      <w:lvlText w:val=""/>
+      <w:lvlJc w:val="left"/>
+      <w:pPr>
+        <w:tabs>
+          <w:tab w:val="num" w:pos="4320"/>
+        </w:tabs>
+        <w:ind w:left="4320" w:hanging="360"/>
+      </w:pPr>
+      <w:rPr>
+        <w:rFonts w:ascii="Wingdings" w:hAnsi="Wingdings" w:hint="default"/>
+        <w:sz w:val="20"/>
+      </w:rPr>
+    </w:lvl>
+    <w:lvl w:ilvl="6" w:tentative="1">
+      <w:start w:val="1"/>
+      <w:numFmt w:val="bullet"/>
+      <w:lvlText w:val=""/>
+      <w:lvlJc w:val="left"/>
+      <w:pPr>
+        <w:tabs>
+          <w:tab w:val="num" w:pos="5040"/>
+        </w:tabs>
+        <w:ind w:left="5040" w:hanging="360"/>
+      </w:pPr>
+      <w:rPr>
+        <w:rFonts w:ascii="Wingdings" w:hAnsi="Wingdings" w:hint="default"/>
+        <w:sz w:val="20"/>
+      </w:rPr>
+    </w:lvl>
+    <w:lvl w:ilvl="7" w:tentative="1">
+      <w:start w:val="1"/>
+      <w:numFmt w:val="bullet"/>
+      <w:lvlText w:val=""/>
+      <w:lvlJc w:val="left"/>
+      <w:pPr>
+        <w:tabs>
+          <w:tab w:val="num" w:pos="5760"/>
+        </w:tabs>
+        <w:ind w:left="5760" w:hanging="360"/>
+      </w:pPr>
+      <w:rPr>
+        <w:rFonts w:ascii="Wingdings" w:hAnsi="Wingdings" w:hint="default"/>
+        <w:sz w:val="20"/>
+      </w:rPr>
+    </w:lvl>
+    <w:lvl w:ilvl="8" w:tentative="1">
+      <w:start w:val="1"/>
+      <w:numFmt w:val="bullet"/>
+      <w:lvlText w:val=""/>
+      <w:lvlJc w:val="left"/>
+      <w:pPr>
+        <w:tabs>
+          <w:tab w:val="num" w:pos="6480"/>
+        </w:tabs>
+        <w:ind w:left="6480" w:hanging="360"/>
+      </w:pPr>
+      <w:rPr>
+        <w:rFonts w:ascii="Wingdings" w:hAnsi="Wingdings" w:hint="default"/>
+        <w:sz w:val="20"/>
+      </w:rPr>
+    </w:lvl>
+  </w:abstractNum>
+  <w:abstractNum w:abstractNumId="14" w15:restartNumberingAfterBreak="0">
     <w:nsid w:val="31816D86"/>
     <w:multiLevelType w:val="multilevel"/>
     <w:tmpl w:val="03228D58"/>
@@ -7827,7 +8141,7 @@
       </w:rPr>
     </w:lvl>
   </w:abstractNum>
-  <w:abstractNum w:abstractNumId="14" w15:restartNumberingAfterBreak="0">
+  <w:abstractNum w:abstractNumId="15" w15:restartNumberingAfterBreak="0">
     <w:nsid w:val="37864491"/>
     <w:multiLevelType w:val="multilevel"/>
     <w:tmpl w:val="54E8CD94"/>
@@ -7976,7 +8290,7 @@
       </w:rPr>
     </w:lvl>
   </w:abstractNum>
-  <w:abstractNum w:abstractNumId="15" w15:restartNumberingAfterBreak="0">
+  <w:abstractNum w:abstractNumId="16" w15:restartNumberingAfterBreak="0">
     <w:nsid w:val="385252EC"/>
     <w:multiLevelType w:val="multilevel"/>
     <w:tmpl w:val="EEDCFF84"/>
@@ -8125,7 +8439,7 @@
       </w:rPr>
     </w:lvl>
   </w:abstractNum>
-  <w:abstractNum w:abstractNumId="16" w15:restartNumberingAfterBreak="0">
+  <w:abstractNum w:abstractNumId="17" w15:restartNumberingAfterBreak="0">
     <w:nsid w:val="389D1822"/>
     <w:multiLevelType w:val="multilevel"/>
     <w:tmpl w:val="E7D6890C"/>
@@ -8274,7 +8588,7 @@
       </w:rPr>
     </w:lvl>
   </w:abstractNum>
-  <w:abstractNum w:abstractNumId="17" w15:restartNumberingAfterBreak="0">
+  <w:abstractNum w:abstractNumId="18" w15:restartNumberingAfterBreak="0">
     <w:nsid w:val="391216BC"/>
     <w:multiLevelType w:val="multilevel"/>
     <w:tmpl w:val="B628A35A"/>
@@ -8423,7 +8737,7 @@
       </w:rPr>
     </w:lvl>
   </w:abstractNum>
-  <w:abstractNum w:abstractNumId="18" w15:restartNumberingAfterBreak="0">
+  <w:abstractNum w:abstractNumId="19" w15:restartNumberingAfterBreak="0">
     <w:nsid w:val="3B7942A0"/>
     <w:multiLevelType w:val="multilevel"/>
     <w:tmpl w:val="7AB4BCBE"/>
@@ -8572,7 +8886,7 @@
       </w:rPr>
     </w:lvl>
   </w:abstractNum>
-  <w:abstractNum w:abstractNumId="19" w15:restartNumberingAfterBreak="0">
+  <w:abstractNum w:abstractNumId="20" w15:restartNumberingAfterBreak="0">
     <w:nsid w:val="3E934090"/>
     <w:multiLevelType w:val="multilevel"/>
     <w:tmpl w:val="273EDC9A"/>
@@ -8721,7 +9035,7 @@
       </w:rPr>
     </w:lvl>
   </w:abstractNum>
-  <w:abstractNum w:abstractNumId="20" w15:restartNumberingAfterBreak="0">
+  <w:abstractNum w:abstractNumId="21" w15:restartNumberingAfterBreak="0">
     <w:nsid w:val="3EEF14AB"/>
     <w:multiLevelType w:val="multilevel"/>
     <w:tmpl w:val="0DFA9B4E"/>
@@ -8870,7 +9184,7 @@
       </w:rPr>
     </w:lvl>
   </w:abstractNum>
-  <w:abstractNum w:abstractNumId="21" w15:restartNumberingAfterBreak="0">
+  <w:abstractNum w:abstractNumId="22" w15:restartNumberingAfterBreak="0">
     <w:nsid w:val="426864D9"/>
     <w:multiLevelType w:val="multilevel"/>
     <w:tmpl w:val="707CB8E2"/>
@@ -9019,7 +9333,7 @@
       </w:rPr>
     </w:lvl>
   </w:abstractNum>
-  <w:abstractNum w:abstractNumId="22" w15:restartNumberingAfterBreak="0">
+  <w:abstractNum w:abstractNumId="23" w15:restartNumberingAfterBreak="0">
     <w:nsid w:val="49354C3B"/>
     <w:multiLevelType w:val="multilevel"/>
     <w:tmpl w:val="0DFA9B4E"/>
@@ -9168,7 +9482,7 @@
       </w:rPr>
     </w:lvl>
   </w:abstractNum>
-  <w:abstractNum w:abstractNumId="23" w15:restartNumberingAfterBreak="0">
+  <w:abstractNum w:abstractNumId="24" w15:restartNumberingAfterBreak="0">
     <w:nsid w:val="4BB94517"/>
     <w:multiLevelType w:val="multilevel"/>
     <w:tmpl w:val="69FE976C"/>
@@ -9317,7 +9631,7 @@
       </w:rPr>
     </w:lvl>
   </w:abstractNum>
-  <w:abstractNum w:abstractNumId="24" w15:restartNumberingAfterBreak="0">
+  <w:abstractNum w:abstractNumId="25" w15:restartNumberingAfterBreak="0">
     <w:nsid w:val="54662238"/>
     <w:multiLevelType w:val="multilevel"/>
     <w:tmpl w:val="EE7A554C"/>
@@ -9466,7 +9780,7 @@
       </w:rPr>
     </w:lvl>
   </w:abstractNum>
-  <w:abstractNum w:abstractNumId="25" w15:restartNumberingAfterBreak="0">
+  <w:abstractNum w:abstractNumId="26" w15:restartNumberingAfterBreak="0">
     <w:nsid w:val="55A73E71"/>
     <w:multiLevelType w:val="multilevel"/>
     <w:tmpl w:val="638093B8"/>
@@ -9615,7 +9929,7 @@
       </w:rPr>
     </w:lvl>
   </w:abstractNum>
-  <w:abstractNum w:abstractNumId="26" w15:restartNumberingAfterBreak="0">
+  <w:abstractNum w:abstractNumId="27" w15:restartNumberingAfterBreak="0">
     <w:nsid w:val="568C13A7"/>
     <w:multiLevelType w:val="multilevel"/>
     <w:tmpl w:val="4E185172"/>
@@ -9728,7 +10042,156 @@
       </w:pPr>
     </w:lvl>
   </w:abstractNum>
-  <w:abstractNum w:abstractNumId="27" w15:restartNumberingAfterBreak="0">
+  <w:abstractNum w:abstractNumId="28" w15:restartNumberingAfterBreak="0">
+    <w:nsid w:val="570A5454"/>
+    <w:multiLevelType w:val="multilevel"/>
+    <w:tmpl w:val="663EF6D8"/>
+    <w:lvl w:ilvl="0">
+      <w:start w:val="1"/>
+      <w:numFmt w:val="bullet"/>
+      <w:lvlText w:val=""/>
+      <w:lvlJc w:val="left"/>
+      <w:pPr>
+        <w:tabs>
+          <w:tab w:val="num" w:pos="720"/>
+        </w:tabs>
+        <w:ind w:left="720" w:hanging="360"/>
+      </w:pPr>
+      <w:rPr>
+        <w:rFonts w:ascii="Symbol" w:hAnsi="Symbol" w:hint="default"/>
+        <w:sz w:val="20"/>
+      </w:rPr>
+    </w:lvl>
+    <w:lvl w:ilvl="1" w:tentative="1">
+      <w:start w:val="1"/>
+      <w:numFmt w:val="bullet"/>
+      <w:lvlText w:val="o"/>
+      <w:lvlJc w:val="left"/>
+      <w:pPr>
+        <w:tabs>
+          <w:tab w:val="num" w:pos="1440"/>
+        </w:tabs>
+        <w:ind w:left="1440" w:hanging="360"/>
+      </w:pPr>
+      <w:rPr>
+        <w:rFonts w:ascii="Courier New" w:hAnsi="Courier New" w:hint="default"/>
+        <w:sz w:val="20"/>
+      </w:rPr>
+    </w:lvl>
+    <w:lvl w:ilvl="2" w:tentative="1">
+      <w:start w:val="1"/>
+      <w:numFmt w:val="bullet"/>
+      <w:lvlText w:val=""/>
+      <w:lvlJc w:val="left"/>
+      <w:pPr>
+        <w:tabs>
+          <w:tab w:val="num" w:pos="2160"/>
+        </w:tabs>
+        <w:ind w:left="2160" w:hanging="360"/>
+      </w:pPr>
+      <w:rPr>
+        <w:rFonts w:ascii="Wingdings" w:hAnsi="Wingdings" w:hint="default"/>
+        <w:sz w:val="20"/>
+      </w:rPr>
+    </w:lvl>
+    <w:lvl w:ilvl="3" w:tentative="1">
+      <w:start w:val="1"/>
+      <w:numFmt w:val="bullet"/>
+      <w:lvlText w:val=""/>
+      <w:lvlJc w:val="left"/>
+      <w:pPr>
+        <w:tabs>
+          <w:tab w:val="num" w:pos="2880"/>
+        </w:tabs>
+        <w:ind w:left="2880" w:hanging="360"/>
+      </w:pPr>
+      <w:rPr>
+        <w:rFonts w:ascii="Wingdings" w:hAnsi="Wingdings" w:hint="default"/>
+        <w:sz w:val="20"/>
+      </w:rPr>
+    </w:lvl>
+    <w:lvl w:ilvl="4" w:tentative="1">
+      <w:start w:val="1"/>
+      <w:numFmt w:val="bullet"/>
+      <w:lvlText w:val=""/>
+      <w:lvlJc w:val="left"/>
+      <w:pPr>
+        <w:tabs>
+          <w:tab w:val="num" w:pos="3600"/>
+        </w:tabs>
+        <w:ind w:left="3600" w:hanging="360"/>
+      </w:pPr>
+      <w:rPr>
+        <w:rFonts w:ascii="Wingdings" w:hAnsi="Wingdings" w:hint="default"/>
+        <w:sz w:val="20"/>
+      </w:rPr>
+    </w:lvl>
+    <w:lvl w:ilvl="5" w:tentative="1">
+      <w:start w:val="1"/>
+      <w:numFmt w:val="bullet"/>
+      <w:lvlText w:val=""/>
+      <w:lvlJc w:val="left"/>
+      <w:pPr>
+        <w:tabs>
+          <w:tab w:val="num" w:pos="4320"/>
+        </w:tabs>
+        <w:ind w:left="4320" w:hanging="360"/>
+      </w:pPr>
+      <w:rPr>
+        <w:rFonts w:ascii="Wingdings" w:hAnsi="Wingdings" w:hint="default"/>
+        <w:sz w:val="20"/>
+      </w:rPr>
+    </w:lvl>
+    <w:lvl w:ilvl="6" w:tentative="1">
+      <w:start w:val="1"/>
+      <w:numFmt w:val="bullet"/>
+      <w:lvlText w:val=""/>
+      <w:lvlJc w:val="left"/>
+      <w:pPr>
+        <w:tabs>
+          <w:tab w:val="num" w:pos="5040"/>
+        </w:tabs>
+        <w:ind w:left="5040" w:hanging="360"/>
+      </w:pPr>
+      <w:rPr>
+        <w:rFonts w:ascii="Wingdings" w:hAnsi="Wingdings" w:hint="default"/>
+        <w:sz w:val="20"/>
+      </w:rPr>
+    </w:lvl>
+    <w:lvl w:ilvl="7" w:tentative="1">
+      <w:start w:val="1"/>
+      <w:numFmt w:val="bullet"/>
+      <w:lvlText w:val=""/>
+      <w:lvlJc w:val="left"/>
+      <w:pPr>
+        <w:tabs>
+          <w:tab w:val="num" w:pos="5760"/>
+        </w:tabs>
+        <w:ind w:left="5760" w:hanging="360"/>
+      </w:pPr>
+      <w:rPr>
+        <w:rFonts w:ascii="Wingdings" w:hAnsi="Wingdings" w:hint="default"/>
+        <w:sz w:val="20"/>
+      </w:rPr>
+    </w:lvl>
+    <w:lvl w:ilvl="8" w:tentative="1">
+      <w:start w:val="1"/>
+      <w:numFmt w:val="bullet"/>
+      <w:lvlText w:val=""/>
+      <w:lvlJc w:val="left"/>
+      <w:pPr>
+        <w:tabs>
+          <w:tab w:val="num" w:pos="6480"/>
+        </w:tabs>
+        <w:ind w:left="6480" w:hanging="360"/>
+      </w:pPr>
+      <w:rPr>
+        <w:rFonts w:ascii="Wingdings" w:hAnsi="Wingdings" w:hint="default"/>
+        <w:sz w:val="20"/>
+      </w:rPr>
+    </w:lvl>
+  </w:abstractNum>
+  <w:abstractNum w:abstractNumId="29" w15:restartNumberingAfterBreak="0">
     <w:nsid w:val="57FE715E"/>
     <w:multiLevelType w:val="multilevel"/>
     <w:tmpl w:val="FFC8431C"/>
@@ -9877,7 +10340,7 @@
       </w:rPr>
     </w:lvl>
   </w:abstractNum>
-  <w:abstractNum w:abstractNumId="28" w15:restartNumberingAfterBreak="0">
+  <w:abstractNum w:abstractNumId="30" w15:restartNumberingAfterBreak="0">
     <w:nsid w:val="5C3244B5"/>
     <w:multiLevelType w:val="multilevel"/>
     <w:tmpl w:val="2D185788"/>
@@ -10026,7 +10489,156 @@
       </w:rPr>
     </w:lvl>
   </w:abstractNum>
-  <w:abstractNum w:abstractNumId="29" w15:restartNumberingAfterBreak="0">
+  <w:abstractNum w:abstractNumId="31" w15:restartNumberingAfterBreak="0">
+    <w:nsid w:val="5DDA4210"/>
+    <w:multiLevelType w:val="multilevel"/>
+    <w:tmpl w:val="663EF6D8"/>
+    <w:lvl w:ilvl="0">
+      <w:start w:val="1"/>
+      <w:numFmt w:val="bullet"/>
+      <w:lvlText w:val=""/>
+      <w:lvlJc w:val="left"/>
+      <w:pPr>
+        <w:tabs>
+          <w:tab w:val="num" w:pos="720"/>
+        </w:tabs>
+        <w:ind w:left="720" w:hanging="360"/>
+      </w:pPr>
+      <w:rPr>
+        <w:rFonts w:ascii="Symbol" w:hAnsi="Symbol" w:hint="default"/>
+        <w:sz w:val="20"/>
+      </w:rPr>
+    </w:lvl>
+    <w:lvl w:ilvl="1" w:tentative="1">
+      <w:start w:val="1"/>
+      <w:numFmt w:val="bullet"/>
+      <w:lvlText w:val="o"/>
+      <w:lvlJc w:val="left"/>
+      <w:pPr>
+        <w:tabs>
+          <w:tab w:val="num" w:pos="1440"/>
+        </w:tabs>
+        <w:ind w:left="1440" w:hanging="360"/>
+      </w:pPr>
+      <w:rPr>
+        <w:rFonts w:ascii="Courier New" w:hAnsi="Courier New" w:hint="default"/>
+        <w:sz w:val="20"/>
+      </w:rPr>
+    </w:lvl>
+    <w:lvl w:ilvl="2" w:tentative="1">
+      <w:start w:val="1"/>
+      <w:numFmt w:val="bullet"/>
+      <w:lvlText w:val=""/>
+      <w:lvlJc w:val="left"/>
+      <w:pPr>
+        <w:tabs>
+          <w:tab w:val="num" w:pos="2160"/>
+        </w:tabs>
+        <w:ind w:left="2160" w:hanging="360"/>
+      </w:pPr>
+      <w:rPr>
+        <w:rFonts w:ascii="Wingdings" w:hAnsi="Wingdings" w:hint="default"/>
+        <w:sz w:val="20"/>
+      </w:rPr>
+    </w:lvl>
+    <w:lvl w:ilvl="3" w:tentative="1">
+      <w:start w:val="1"/>
+      <w:numFmt w:val="bullet"/>
+      <w:lvlText w:val=""/>
+      <w:lvlJc w:val="left"/>
+      <w:pPr>
+        <w:tabs>
+          <w:tab w:val="num" w:pos="2880"/>
+        </w:tabs>
+        <w:ind w:left="2880" w:hanging="360"/>
+      </w:pPr>
+      <w:rPr>
+        <w:rFonts w:ascii="Wingdings" w:hAnsi="Wingdings" w:hint="default"/>
+        <w:sz w:val="20"/>
+      </w:rPr>
+    </w:lvl>
+    <w:lvl w:ilvl="4" w:tentative="1">
+      <w:start w:val="1"/>
+      <w:numFmt w:val="bullet"/>
+      <w:lvlText w:val=""/>
+      <w:lvlJc w:val="left"/>
+      <w:pPr>
+        <w:tabs>
+          <w:tab w:val="num" w:pos="3600"/>
+        </w:tabs>
+        <w:ind w:left="3600" w:hanging="360"/>
+      </w:pPr>
+      <w:rPr>
+        <w:rFonts w:ascii="Wingdings" w:hAnsi="Wingdings" w:hint="default"/>
+        <w:sz w:val="20"/>
+      </w:rPr>
+    </w:lvl>
+    <w:lvl w:ilvl="5" w:tentative="1">
+      <w:start w:val="1"/>
+      <w:numFmt w:val="bullet"/>
+      <w:lvlText w:val=""/>
+      <w:lvlJc w:val="left"/>
+      <w:pPr>
+        <w:tabs>
+          <w:tab w:val="num" w:pos="4320"/>
+        </w:tabs>
+        <w:ind w:left="4320" w:hanging="360"/>
+      </w:pPr>
+      <w:rPr>
+        <w:rFonts w:ascii="Wingdings" w:hAnsi="Wingdings" w:hint="default"/>
+        <w:sz w:val="20"/>
+      </w:rPr>
+    </w:lvl>
+    <w:lvl w:ilvl="6" w:tentative="1">
+      <w:start w:val="1"/>
+      <w:numFmt w:val="bullet"/>
+      <w:lvlText w:val=""/>
+      <w:lvlJc w:val="left"/>
+      <w:pPr>
+        <w:tabs>
+          <w:tab w:val="num" w:pos="5040"/>
+        </w:tabs>
+        <w:ind w:left="5040" w:hanging="360"/>
+      </w:pPr>
+      <w:rPr>
+        <w:rFonts w:ascii="Wingdings" w:hAnsi="Wingdings" w:hint="default"/>
+        <w:sz w:val="20"/>
+      </w:rPr>
+    </w:lvl>
+    <w:lvl w:ilvl="7" w:tentative="1">
+      <w:start w:val="1"/>
+      <w:numFmt w:val="bullet"/>
+      <w:lvlText w:val=""/>
+      <w:lvlJc w:val="left"/>
+      <w:pPr>
+        <w:tabs>
+          <w:tab w:val="num" w:pos="5760"/>
+        </w:tabs>
+        <w:ind w:left="5760" w:hanging="360"/>
+      </w:pPr>
+      <w:rPr>
+        <w:rFonts w:ascii="Wingdings" w:hAnsi="Wingdings" w:hint="default"/>
+        <w:sz w:val="20"/>
+      </w:rPr>
+    </w:lvl>
+    <w:lvl w:ilvl="8" w:tentative="1">
+      <w:start w:val="1"/>
+      <w:numFmt w:val="bullet"/>
+      <w:lvlText w:val=""/>
+      <w:lvlJc w:val="left"/>
+      <w:pPr>
+        <w:tabs>
+          <w:tab w:val="num" w:pos="6480"/>
+        </w:tabs>
+        <w:ind w:left="6480" w:hanging="360"/>
+      </w:pPr>
+      <w:rPr>
+        <w:rFonts w:ascii="Wingdings" w:hAnsi="Wingdings" w:hint="default"/>
+        <w:sz w:val="20"/>
+      </w:rPr>
+    </w:lvl>
+  </w:abstractNum>
+  <w:abstractNum w:abstractNumId="32" w15:restartNumberingAfterBreak="0">
     <w:nsid w:val="67F15432"/>
     <w:multiLevelType w:val="multilevel"/>
     <w:tmpl w:val="6DAE0EAC"/>
@@ -10175,7 +10787,7 @@
       </w:rPr>
     </w:lvl>
   </w:abstractNum>
-  <w:abstractNum w:abstractNumId="30" w15:restartNumberingAfterBreak="0">
+  <w:abstractNum w:abstractNumId="33" w15:restartNumberingAfterBreak="0">
     <w:nsid w:val="6AE35169"/>
     <w:multiLevelType w:val="multilevel"/>
     <w:tmpl w:val="0DFA9B4E"/>
@@ -10324,7 +10936,7 @@
       </w:rPr>
     </w:lvl>
   </w:abstractNum>
-  <w:abstractNum w:abstractNumId="31" w15:restartNumberingAfterBreak="0">
+  <w:abstractNum w:abstractNumId="34" w15:restartNumberingAfterBreak="0">
     <w:nsid w:val="71B614AE"/>
     <w:multiLevelType w:val="multilevel"/>
     <w:tmpl w:val="5C8E28B2"/>
@@ -10473,7 +11085,7 @@
       </w:rPr>
     </w:lvl>
   </w:abstractNum>
-  <w:abstractNum w:abstractNumId="32" w15:restartNumberingAfterBreak="0">
+  <w:abstractNum w:abstractNumId="35" w15:restartNumberingAfterBreak="0">
     <w:nsid w:val="79A04355"/>
     <w:multiLevelType w:val="multilevel"/>
     <w:tmpl w:val="A2447F00"/>
@@ -10622,7 +11234,7 @@
       </w:rPr>
     </w:lvl>
   </w:abstractNum>
-  <w:abstractNum w:abstractNumId="33" w15:restartNumberingAfterBreak="0">
+  <w:abstractNum w:abstractNumId="36" w15:restartNumberingAfterBreak="0">
     <w:nsid w:val="7BC74D82"/>
     <w:multiLevelType w:val="multilevel"/>
     <w:tmpl w:val="66A09D5C"/>
@@ -10771,7 +11383,7 @@
       </w:rPr>
     </w:lvl>
   </w:abstractNum>
-  <w:abstractNum w:abstractNumId="34" w15:restartNumberingAfterBreak="0">
+  <w:abstractNum w:abstractNumId="37" w15:restartNumberingAfterBreak="0">
     <w:nsid w:val="7F094DE5"/>
     <w:multiLevelType w:val="multilevel"/>
     <w:tmpl w:val="E682C87E"/>
@@ -10921,13 +11533,13 @@
     </w:lvl>
   </w:abstractNum>
   <w:num w:numId="1" w16cid:durableId="1845625895">
-    <w:abstractNumId w:val="27"/>
+    <w:abstractNumId w:val="29"/>
   </w:num>
   <w:num w:numId="2" w16cid:durableId="1820800475">
     <w:abstractNumId w:val="1"/>
   </w:num>
   <w:num w:numId="3" w16cid:durableId="753939106">
-    <w:abstractNumId w:val="28"/>
+    <w:abstractNumId w:val="30"/>
   </w:num>
   <w:num w:numId="4" w16cid:durableId="254246660">
     <w:abstractNumId w:val="12"/>
@@ -10936,16 +11548,16 @@
     <w:abstractNumId w:val="7"/>
   </w:num>
   <w:num w:numId="6" w16cid:durableId="291518041">
-    <w:abstractNumId w:val="29"/>
+    <w:abstractNumId w:val="32"/>
   </w:num>
   <w:num w:numId="7" w16cid:durableId="1886871924">
-    <w:abstractNumId w:val="13"/>
+    <w:abstractNumId w:val="14"/>
   </w:num>
   <w:num w:numId="8" w16cid:durableId="500051649">
-    <w:abstractNumId w:val="33"/>
+    <w:abstractNumId w:val="36"/>
   </w:num>
   <w:num w:numId="9" w16cid:durableId="1402144921">
-    <w:abstractNumId w:val="24"/>
+    <w:abstractNumId w:val="25"/>
   </w:num>
   <w:num w:numId="10" w16cid:durableId="1888292864">
     <w:abstractNumId w:val="3"/>
@@ -10957,31 +11569,31 @@
     <w:abstractNumId w:val="10"/>
   </w:num>
   <w:num w:numId="13" w16cid:durableId="833764300">
-    <w:abstractNumId w:val="17"/>
+    <w:abstractNumId w:val="18"/>
   </w:num>
   <w:num w:numId="14" w16cid:durableId="472717610">
-    <w:abstractNumId w:val="14"/>
+    <w:abstractNumId w:val="15"/>
   </w:num>
   <w:num w:numId="15" w16cid:durableId="1546718634">
     <w:abstractNumId w:val="6"/>
   </w:num>
   <w:num w:numId="16" w16cid:durableId="1127313156">
-    <w:abstractNumId w:val="25"/>
+    <w:abstractNumId w:val="26"/>
   </w:num>
   <w:num w:numId="17" w16cid:durableId="1386567130">
-    <w:abstractNumId w:val="23"/>
+    <w:abstractNumId w:val="24"/>
   </w:num>
   <w:num w:numId="18" w16cid:durableId="915676262">
-    <w:abstractNumId w:val="21"/>
+    <w:abstractNumId w:val="22"/>
   </w:num>
   <w:num w:numId="19" w16cid:durableId="452483329">
-    <w:abstractNumId w:val="15"/>
+    <w:abstractNumId w:val="16"/>
   </w:num>
   <w:num w:numId="20" w16cid:durableId="1063139619">
-    <w:abstractNumId w:val="19"/>
+    <w:abstractNumId w:val="20"/>
   </w:num>
   <w:num w:numId="21" w16cid:durableId="1030110892">
-    <w:abstractNumId w:val="18"/>
+    <w:abstractNumId w:val="19"/>
   </w:num>
   <w:num w:numId="22" w16cid:durableId="1986857964">
     <w:abstractNumId w:val="4"/>
@@ -10993,16 +11605,16 @@
     <w:abstractNumId w:val="9"/>
   </w:num>
   <w:num w:numId="25" w16cid:durableId="91319527">
-    <w:abstractNumId w:val="16"/>
+    <w:abstractNumId w:val="17"/>
   </w:num>
   <w:num w:numId="26" w16cid:durableId="1610314402">
     <w:abstractNumId w:val="5"/>
   </w:num>
   <w:num w:numId="27" w16cid:durableId="1647511210">
-    <w:abstractNumId w:val="32"/>
+    <w:abstractNumId w:val="35"/>
   </w:num>
   <w:num w:numId="28" w16cid:durableId="192767943">
-    <w:abstractNumId w:val="26"/>
+    <w:abstractNumId w:val="27"/>
   </w:num>
   <w:num w:numId="29" w16cid:durableId="1498351223">
     <w:abstractNumId w:val="8"/>
@@ -11011,19 +11623,28 @@
     <w:abstractNumId w:val="11"/>
   </w:num>
   <w:num w:numId="31" w16cid:durableId="153759686">
+    <w:abstractNumId w:val="37"/>
+  </w:num>
+  <w:num w:numId="32" w16cid:durableId="325940656">
     <w:abstractNumId w:val="34"/>
   </w:num>
-  <w:num w:numId="32" w16cid:durableId="325940656">
+  <w:num w:numId="33" w16cid:durableId="895706198">
+    <w:abstractNumId w:val="21"/>
+  </w:num>
+  <w:num w:numId="34" w16cid:durableId="923495235">
+    <w:abstractNumId w:val="23"/>
+  </w:num>
+  <w:num w:numId="35" w16cid:durableId="1917475775">
+    <w:abstractNumId w:val="33"/>
+  </w:num>
+  <w:num w:numId="36" w16cid:durableId="1083529838">
     <w:abstractNumId w:val="31"/>
   </w:num>
-  <w:num w:numId="33" w16cid:durableId="895706198">
-    <w:abstractNumId w:val="20"/>
+  <w:num w:numId="37" w16cid:durableId="973606329">
+    <w:abstractNumId w:val="13"/>
   </w:num>
-  <w:num w:numId="34" w16cid:durableId="923495235">
-    <w:abstractNumId w:val="22"/>
-  </w:num>
-  <w:num w:numId="35" w16cid:durableId="1917475775">
-    <w:abstractNumId w:val="30"/>
+  <w:num w:numId="38" w16cid:durableId="129323712">
+    <w:abstractNumId w:val="28"/>
   </w:num>
 </w:numbering>
 </file>
@@ -11632,7 +12253,6 @@
   <w:style w:type="character" w:default="1" w:styleId="DefaultParagraphFont">
     <w:name w:val="Default Paragraph Font"/>
     <w:uiPriority w:val="1"/>
-    <w:semiHidden/>
     <w:unhideWhenUsed/>
   </w:style>
   <w:style w:type="table" w:default="1" w:styleId="TableNormal">

</xml_diff>

<commit_message>
feat: implement admin panel functionality to manage and view reviews
</commit_message>
<xml_diff>
--- a/Documentation/📘 DOCTOR APPOINTMENT MANAGEMENT SYSTEM ( CareSlot ).docx
+++ b/Documentation/📘 DOCTOR APPOINTMENT MANAGEMENT SYSTEM ( CareSlot ).docx
@@ -40,29 +40,7 @@
           <w:sz w:val="24"/>
           <w:szCs w:val="24"/>
         </w:rPr>
-        <w:t xml:space="preserve"> (</w:t>
-      </w:r>
-      <w:proofErr w:type="spellStart"/>
-      <w:r>
-        <w:rPr>
-          <w:rFonts w:ascii="Arial" w:hAnsi="Arial" w:cs="Arial"/>
-          <w:b/>
-          <w:bCs/>
-          <w:sz w:val="24"/>
-          <w:szCs w:val="24"/>
-        </w:rPr>
-        <w:t>CareSlot</w:t>
-      </w:r>
-      <w:proofErr w:type="spellEnd"/>
-      <w:r>
-        <w:rPr>
-          <w:rFonts w:ascii="Arial" w:hAnsi="Arial" w:cs="Arial"/>
-          <w:b/>
-          <w:bCs/>
-          <w:sz w:val="24"/>
-          <w:szCs w:val="24"/>
-        </w:rPr>
-        <w:t>)</w:t>
+        <w:t xml:space="preserve"> (CareSlot)</w:t>
       </w:r>
     </w:p>
     <w:p>
@@ -668,25 +646,7 @@
           <w:sz w:val="24"/>
           <w:szCs w:val="24"/>
         </w:rPr>
-        <w:t>Integrate online payments (</w:t>
-      </w:r>
-      <w:proofErr w:type="spellStart"/>
-      <w:r>
-        <w:rPr>
-          <w:rFonts w:ascii="Arial" w:hAnsi="Arial" w:cs="Arial"/>
-          <w:sz w:val="24"/>
-          <w:szCs w:val="24"/>
-        </w:rPr>
-        <w:t>Razorpay</w:t>
-      </w:r>
-      <w:proofErr w:type="spellEnd"/>
-      <w:r>
-        <w:rPr>
-          <w:rFonts w:ascii="Arial" w:hAnsi="Arial" w:cs="Arial"/>
-          <w:sz w:val="24"/>
-          <w:szCs w:val="24"/>
-        </w:rPr>
-        <w:t>)</w:t>
+        <w:t>Integrate online payments (Razorpay)</w:t>
       </w:r>
     </w:p>
     <w:p>
@@ -1587,7 +1547,6 @@
           <w:szCs w:val="24"/>
         </w:rPr>
       </w:pPr>
-      <w:proofErr w:type="spellStart"/>
       <w:r>
         <w:rPr>
           <w:rFonts w:ascii="Arial" w:hAnsi="Arial" w:cs="Arial"/>
@@ -1596,7 +1555,6 @@
         </w:rPr>
         <w:t>consultationFee</w:t>
       </w:r>
-      <w:proofErr w:type="spellEnd"/>
     </w:p>
     <w:p>
       <w:pPr>
@@ -2504,6 +2462,27 @@
           <w:sz w:val="24"/>
           <w:szCs w:val="24"/>
         </w:rPr>
+        <w:t xml:space="preserve">Download Excel File </w:t>
+      </w:r>
+    </w:p>
+    <w:p>
+      <w:pPr>
+        <w:numPr>
+          <w:ilvl w:val="0"/>
+          <w:numId w:val="10"/>
+        </w:numPr>
+        <w:rPr>
+          <w:rFonts w:ascii="Arial" w:hAnsi="Arial" w:cs="Arial"/>
+          <w:sz w:val="24"/>
+          <w:szCs w:val="24"/>
+        </w:rPr>
+      </w:pPr>
+      <w:r>
+        <w:rPr>
+          <w:rFonts w:ascii="Arial" w:hAnsi="Arial" w:cs="Arial"/>
+          <w:sz w:val="24"/>
+          <w:szCs w:val="24"/>
+        </w:rPr>
         <w:t>Number of:</w:t>
       </w:r>
     </w:p>
@@ -2683,7 +2662,6 @@
           <w:szCs w:val="24"/>
         </w:rPr>
       </w:pPr>
-      <w:proofErr w:type="spellStart"/>
       <w:r>
         <w:rPr>
           <w:rFonts w:ascii="Arial" w:hAnsi="Arial" w:cs="Arial"/>
@@ -2692,7 +2670,6 @@
         </w:rPr>
         <w:t>Razorpay</w:t>
       </w:r>
-      <w:proofErr w:type="spellEnd"/>
     </w:p>
     <w:p>
       <w:pPr>
@@ -3045,7 +3022,6 @@
         </w:rPr>
         <w:t xml:space="preserve"> </w:t>
       </w:r>
-      <w:proofErr w:type="spellStart"/>
       <w:r>
         <w:rPr>
           <w:rFonts w:ascii="Arial" w:hAnsi="Arial" w:cs="Arial"/>
@@ -3056,7 +3032,6 @@
         </w:rPr>
         <w:t>availableSlots</w:t>
       </w:r>
-      <w:proofErr w:type="spellEnd"/>
     </w:p>
     <w:p>
       <w:pPr>
@@ -3079,7 +3054,6 @@
         </w:rPr>
         <w:t xml:space="preserve">Show </w:t>
       </w:r>
-      <w:proofErr w:type="spellStart"/>
       <w:r>
         <w:rPr>
           <w:rFonts w:ascii="Arial" w:hAnsi="Arial" w:cs="Arial"/>
@@ -3088,7 +3062,6 @@
         </w:rPr>
         <w:t>availableSlots</w:t>
       </w:r>
-      <w:proofErr w:type="spellEnd"/>
     </w:p>
     <w:p>
       <w:pPr>
@@ -3111,7 +3084,6 @@
         </w:rPr>
         <w:t xml:space="preserve">Add new </w:t>
       </w:r>
-      <w:proofErr w:type="spellStart"/>
       <w:r>
         <w:rPr>
           <w:rFonts w:ascii="Arial" w:hAnsi="Arial" w:cs="Arial"/>
@@ -3120,7 +3092,28 @@
         </w:rPr>
         <w:t>availableSlots</w:t>
       </w:r>
-      <w:proofErr w:type="spellEnd"/>
+    </w:p>
+    <w:p>
+      <w:pPr>
+        <w:pStyle w:val="ListParagraph"/>
+        <w:numPr>
+          <w:ilvl w:val="0"/>
+          <w:numId w:val="35"/>
+        </w:numPr>
+        <w:rPr>
+          <w:rFonts w:ascii="Arial" w:hAnsi="Arial" w:cs="Arial"/>
+          <w:sz w:val="24"/>
+          <w:szCs w:val="24"/>
+        </w:rPr>
+      </w:pPr>
+      <w:r>
+        <w:rPr>
+          <w:rFonts w:ascii="Arial" w:hAnsi="Arial" w:cs="Arial"/>
+          <w:sz w:val="24"/>
+          <w:szCs w:val="24"/>
+        </w:rPr>
+        <w:t>Delete availaableSlot</w:t>
+      </w:r>
     </w:p>
     <w:p>
       <w:pPr>
@@ -3223,6 +3216,7 @@
           <w:sz w:val="24"/>
           <w:szCs w:val="24"/>
         </w:rPr>
+        <w:lastRenderedPageBreak/>
         <w:t>Update profile</w:t>
       </w:r>
     </w:p>
@@ -3428,6 +3422,27 @@
           <w:sz w:val="24"/>
           <w:szCs w:val="24"/>
         </w:rPr>
+        <w:t xml:space="preserve">Download Excel File </w:t>
+      </w:r>
+    </w:p>
+    <w:p>
+      <w:pPr>
+        <w:numPr>
+          <w:ilvl w:val="0"/>
+          <w:numId w:val="15"/>
+        </w:numPr>
+        <w:rPr>
+          <w:rFonts w:ascii="Arial" w:hAnsi="Arial" w:cs="Arial"/>
+          <w:sz w:val="24"/>
+          <w:szCs w:val="24"/>
+        </w:rPr>
+      </w:pPr>
+      <w:r>
+        <w:rPr>
+          <w:rFonts w:ascii="Arial" w:hAnsi="Arial" w:cs="Arial"/>
+          <w:sz w:val="24"/>
+          <w:szCs w:val="24"/>
+        </w:rPr>
         <w:t>Charts for analytics</w:t>
       </w:r>
     </w:p>
@@ -3679,74 +3694,8 @@
           <w:sz w:val="24"/>
           <w:szCs w:val="24"/>
         </w:rPr>
-        <w:t xml:space="preserve"> (</w:t>
-      </w:r>
-      <w:proofErr w:type="spellStart"/>
-      <w:proofErr w:type="gramStart"/>
-      <w:r>
-        <w:rPr>
-          <w:rFonts w:ascii="Arial" w:hAnsi="Arial" w:cs="Arial"/>
-          <w:sz w:val="24"/>
-          <w:szCs w:val="24"/>
-        </w:rPr>
-        <w:t>name,email</w:t>
-      </w:r>
-      <w:proofErr w:type="spellEnd"/>
-      <w:proofErr w:type="gramEnd"/>
-      <w:r>
-        <w:rPr>
-          <w:rFonts w:ascii="Arial" w:hAnsi="Arial" w:cs="Arial"/>
-          <w:sz w:val="24"/>
-          <w:szCs w:val="24"/>
-        </w:rPr>
-        <w:t xml:space="preserve">, image, Number </w:t>
-      </w:r>
-      <w:proofErr w:type="gramStart"/>
-      <w:r>
-        <w:rPr>
-          <w:rFonts w:ascii="Arial" w:hAnsi="Arial" w:cs="Arial"/>
-          <w:sz w:val="24"/>
-          <w:szCs w:val="24"/>
-        </w:rPr>
-        <w:t>of  booking</w:t>
-      </w:r>
-      <w:proofErr w:type="gramEnd"/>
-      <w:r>
-        <w:rPr>
-          <w:rFonts w:ascii="Arial" w:hAnsi="Arial" w:cs="Arial"/>
-          <w:sz w:val="24"/>
-          <w:szCs w:val="24"/>
-        </w:rPr>
-        <w:t xml:space="preserve"> </w:t>
-      </w:r>
-      <w:proofErr w:type="gramStart"/>
-      <w:r>
-        <w:rPr>
-          <w:rFonts w:ascii="Arial" w:hAnsi="Arial" w:cs="Arial"/>
-          <w:sz w:val="24"/>
-          <w:szCs w:val="24"/>
-        </w:rPr>
-        <w:t>it’s</w:t>
-      </w:r>
-      <w:proofErr w:type="gramEnd"/>
-      <w:r>
-        <w:rPr>
-          <w:rFonts w:ascii="Arial" w:hAnsi="Arial" w:cs="Arial"/>
-          <w:sz w:val="24"/>
-          <w:szCs w:val="24"/>
-        </w:rPr>
-        <w:t xml:space="preserve"> </w:t>
-      </w:r>
-      <w:proofErr w:type="gramStart"/>
-      <w:r>
-        <w:rPr>
-          <w:rFonts w:ascii="Arial" w:hAnsi="Arial" w:cs="Arial"/>
-          <w:sz w:val="24"/>
-          <w:szCs w:val="24"/>
-        </w:rPr>
-        <w:t>Patient )</w:t>
-      </w:r>
-      <w:proofErr w:type="gramEnd"/>
+        <w:t xml:space="preserve"> (name,email, image, Number of  booking it’s Patient )</w:t>
+      </w:r>
     </w:p>
     <w:p>
       <w:pPr>
@@ -3966,6 +3915,27 @@
     </w:p>
     <w:p>
       <w:pPr>
+        <w:numPr>
+          <w:ilvl w:val="1"/>
+          <w:numId w:val="18"/>
+        </w:numPr>
+        <w:rPr>
+          <w:rFonts w:ascii="Arial" w:hAnsi="Arial" w:cs="Arial"/>
+          <w:sz w:val="24"/>
+          <w:szCs w:val="24"/>
+        </w:rPr>
+      </w:pPr>
+      <w:r>
+        <w:rPr>
+          <w:rFonts w:ascii="Arial" w:hAnsi="Arial" w:cs="Arial"/>
+          <w:sz w:val="24"/>
+          <w:szCs w:val="24"/>
+        </w:rPr>
+        <w:t>Commission</w:t>
+      </w:r>
+    </w:p>
+    <w:p>
+      <w:pPr>
         <w:rPr>
           <w:rFonts w:ascii="Arial" w:hAnsi="Arial" w:cs="Arial"/>
           <w:sz w:val="24"/>
@@ -4106,18 +4076,8 @@
           <w:sz w:val="24"/>
           <w:szCs w:val="24"/>
         </w:rPr>
-        <w:t xml:space="preserve">Password hashing using </w:t>
-      </w:r>
-      <w:proofErr w:type="spellStart"/>
-      <w:r>
-        <w:rPr>
-          <w:rFonts w:ascii="Arial" w:hAnsi="Arial" w:cs="Arial"/>
-          <w:sz w:val="24"/>
-          <w:szCs w:val="24"/>
-        </w:rPr>
-        <w:t>Bcrypt</w:t>
-      </w:r>
-      <w:proofErr w:type="spellEnd"/>
+        <w:t>Password hashing using Bcrypt</w:t>
+      </w:r>
     </w:p>
     <w:p>
       <w:pPr>
@@ -5115,18 +5075,8 @@
           <w:sz w:val="24"/>
           <w:szCs w:val="24"/>
         </w:rPr>
-        <w:t xml:space="preserve">Schema </w:t>
-      </w:r>
-      <w:proofErr w:type="spellStart"/>
-      <w:r>
-        <w:rPr>
-          <w:rFonts w:ascii="Arial" w:hAnsi="Arial" w:cs="Arial"/>
-          <w:sz w:val="24"/>
-          <w:szCs w:val="24"/>
-        </w:rPr>
-        <w:t>modeling</w:t>
-      </w:r>
-      <w:proofErr w:type="spellEnd"/>
+        <w:t>Schema modeling</w:t>
+      </w:r>
     </w:p>
     <w:p>
       <w:pPr>
@@ -5247,7 +5197,6 @@
           <w:szCs w:val="24"/>
         </w:rPr>
       </w:pPr>
-      <w:proofErr w:type="spellStart"/>
       <w:r>
         <w:rPr>
           <w:rFonts w:ascii="Arial" w:hAnsi="Arial" w:cs="Arial"/>
@@ -5258,7 +5207,6 @@
         </w:rPr>
         <w:t>Bcrypt</w:t>
       </w:r>
-      <w:proofErr w:type="spellEnd"/>
     </w:p>
     <w:p>
       <w:pPr>
@@ -5334,7 +5282,6 @@
           <w:szCs w:val="24"/>
         </w:rPr>
       </w:pPr>
-      <w:proofErr w:type="spellStart"/>
       <w:r>
         <w:rPr>
           <w:rFonts w:ascii="Arial" w:hAnsi="Arial" w:cs="Arial"/>
@@ -5345,7 +5292,6 @@
         </w:rPr>
         <w:t>Razorpay</w:t>
       </w:r>
-      <w:proofErr w:type="spellEnd"/>
     </w:p>
     <w:p>
       <w:pPr>
@@ -5449,20 +5395,8 @@
           <w:sz w:val="24"/>
           <w:szCs w:val="24"/>
         </w:rPr>
-        <w:t xml:space="preserve">• </w:t>
-      </w:r>
-      <w:proofErr w:type="spellStart"/>
-      <w:r>
-        <w:rPr>
-          <w:rFonts w:ascii="Arial" w:hAnsi="Arial" w:cs="Arial"/>
-          <w:b/>
-          <w:bCs/>
-          <w:sz w:val="24"/>
-          <w:szCs w:val="24"/>
-        </w:rPr>
-        <w:t>Nodemailer</w:t>
-      </w:r>
-      <w:proofErr w:type="spellEnd"/>
+        <w:t>• Nodemailer</w:t>
+      </w:r>
     </w:p>
     <w:p>
       <w:pPr>
@@ -12253,6 +12187,7 @@
   <w:style w:type="character" w:default="1" w:styleId="DefaultParagraphFont">
     <w:name w:val="Default Paragraph Font"/>
     <w:uiPriority w:val="1"/>
+    <w:semiHidden/>
     <w:unhideWhenUsed/>
   </w:style>
   <w:style w:type="table" w:default="1" w:styleId="TableNormal">

</xml_diff>